<commit_message>
Test results and code update for adaptive, analyze_results and load_test
</commit_message>
<xml_diff>
--- a/Results of dynamic implementation.docx
+++ b/Results of dynamic implementation.docx
@@ -264,10 +264,7 @@
       </w:r>
       <w:proofErr w:type="spellEnd"/>
       <w:r>
-        <w:t xml:space="preserve"> limit for the stress test was </w:t>
-      </w:r>
-      <w:r>
-        <w:t>1.0</w:t>
+        <w:t xml:space="preserve"> limit for the stress test was 1.0</w:t>
       </w:r>
     </w:p>
     <w:p/>
@@ -502,13 +499,7 @@
       </w:r>
       <w:proofErr w:type="spellEnd"/>
       <w:r>
-        <w:t xml:space="preserve"> pool was </w:t>
-      </w:r>
-      <w:r>
-        <w:t>10</w:t>
-      </w:r>
-      <w:r>
-        <w:t xml:space="preserve">0 for both case and </w:t>
+        <w:t xml:space="preserve"> pool was 100 for both case and </w:t>
       </w:r>
       <w:proofErr w:type="spellStart"/>
       <w:r>
@@ -623,17 +614,12 @@
         <w:t xml:space="preserve"> Average (Under Load): 40.58 </w:t>
       </w:r>
       <w:proofErr w:type="spellStart"/>
-      <w:proofErr w:type="gramStart"/>
-      <w:r>
-        <w:t>ms</w:t>
-      </w:r>
-      <w:proofErr w:type="spellEnd"/>
-      <w:r>
-        <w:t xml:space="preserve">  &lt;</w:t>
-      </w:r>
-      <w:proofErr w:type="gramEnd"/>
-      <w:r>
-        <w:t>-- USE THIS FOR PAPER</w:t>
+      <w:r>
+        <w:t>ms</w:t>
+      </w:r>
+      <w:proofErr w:type="spellEnd"/>
+      <w:r>
+        <w:t xml:space="preserve">  </w:t>
       </w:r>
     </w:p>
     <w:p/>
@@ -724,6 +710,11 @@
       <w:proofErr w:type="spellEnd"/>
     </w:p>
     <w:p>
+      <w:pPr>
+        <w:pBdr>
+          <w:bottom w:val="double" w:sz="6" w:space="1" w:color="auto"/>
+        </w:pBdr>
+      </w:pPr>
       <w:r>
         <w:rPr>
           <w:rFonts w:ascii="Segoe UI Emoji" w:hAnsi="Segoe UI Emoji" w:cs="Segoe UI Emoji"/>
@@ -734,18 +725,250 @@
         <w:t xml:space="preserve"> Average (Under Load): 24.86 </w:t>
       </w:r>
       <w:proofErr w:type="spellStart"/>
-      <w:proofErr w:type="gramStart"/>
-      <w:r>
-        <w:t>ms</w:t>
-      </w:r>
-      <w:proofErr w:type="spellEnd"/>
-      <w:r>
-        <w:t xml:space="preserve">  &lt;</w:t>
-      </w:r>
-      <w:proofErr w:type="gramEnd"/>
-      <w:r>
-        <w:t>-- USE THIS FOR PAPER</w:t>
-      </w:r>
+      <w:r>
+        <w:t>ms</w:t>
+      </w:r>
+      <w:proofErr w:type="spellEnd"/>
+      <w:r>
+        <w:t xml:space="preserve">  </w:t>
+      </w:r>
+    </w:p>
+    <w:p>
+      <w:r>
+        <w:t xml:space="preserve">Below results when </w:t>
+      </w:r>
+      <w:proofErr w:type="spellStart"/>
+      <w:r>
+        <w:t>maxmimum</w:t>
+      </w:r>
+      <w:proofErr w:type="spellEnd"/>
+      <w:r>
+        <w:t xml:space="preserve"> pool was 100 for both case and </w:t>
+      </w:r>
+      <w:proofErr w:type="spellStart"/>
+      <w:r>
+        <w:t>cpu</w:t>
+      </w:r>
+      <w:proofErr w:type="spellEnd"/>
+      <w:r>
+        <w:t xml:space="preserve"> limit for the stress test was </w:t>
+      </w:r>
+      <w:r>
+        <w:t>2</w:t>
+      </w:r>
+      <w:r>
+        <w:t>.0</w:t>
+      </w:r>
+    </w:p>
+    <w:p>
+      <w:r>
+        <w:t xml:space="preserve">PS E:\College\PG\adaptive-database-connection-pooling\research-pool-lab&gt; node analyze_results.js results_static.csv                            </w:t>
+      </w:r>
+    </w:p>
+    <w:p/>
+    <w:p>
+      <w:r>
+        <w:rPr>
+          <w:rFonts w:ascii="Segoe UI Emoji" w:hAnsi="Segoe UI Emoji" w:cs="Segoe UI Emoji"/>
+        </w:rPr>
+        <w:t>📊</w:t>
+      </w:r>
+      <w:r>
+        <w:t xml:space="preserve"> ANALYSIS REPORT FOR: results_static.csv</w:t>
+      </w:r>
+    </w:p>
+    <w:p>
+      <w:r>
+        <w:t>========================================</w:t>
+      </w:r>
+    </w:p>
+    <w:p>
+      <w:r>
+        <w:rPr>
+          <w:rFonts w:ascii="Segoe UI Emoji" w:hAnsi="Segoe UI Emoji" w:cs="Segoe UI Emoji"/>
+        </w:rPr>
+        <w:t>🔹</w:t>
+      </w:r>
+      <w:r>
+        <w:t xml:space="preserve"> Total Data Points:  1320</w:t>
+      </w:r>
+    </w:p>
+    <w:p>
+      <w:r>
+        <w:rPr>
+          <w:rFonts w:ascii="Segoe UI Emoji" w:hAnsi="Segoe UI Emoji" w:cs="Segoe UI Emoji"/>
+        </w:rPr>
+        <w:t>🟢</w:t>
+      </w:r>
+      <w:r>
+        <w:t xml:space="preserve"> Minimum Lag:        2 </w:t>
+      </w:r>
+      <w:proofErr w:type="spellStart"/>
+      <w:r>
+        <w:t>ms</w:t>
+      </w:r>
+      <w:proofErr w:type="spellEnd"/>
+    </w:p>
+    <w:p>
+      <w:r>
+        <w:rPr>
+          <w:rFonts w:ascii="Segoe UI Emoji" w:hAnsi="Segoe UI Emoji" w:cs="Segoe UI Emoji"/>
+        </w:rPr>
+        <w:t>🔴</w:t>
+      </w:r>
+      <w:r>
+        <w:t xml:space="preserve"> Maximum Lag:        1151 </w:t>
+      </w:r>
+      <w:proofErr w:type="spellStart"/>
+      <w:r>
+        <w:t>ms</w:t>
+      </w:r>
+      <w:proofErr w:type="spellEnd"/>
+    </w:p>
+    <w:p>
+      <w:r>
+        <w:t>----------------------------------------</w:t>
+      </w:r>
+    </w:p>
+    <w:p>
+      <w:r>
+        <w:rPr>
+          <w:rFonts w:ascii="Segoe UI Emoji" w:hAnsi="Segoe UI Emoji" w:cs="Segoe UI Emoji"/>
+        </w:rPr>
+        <w:lastRenderedPageBreak/>
+        <w:t>📉</w:t>
+      </w:r>
+      <w:r>
+        <w:t xml:space="preserve"> Average (Overall):  28.11 </w:t>
+      </w:r>
+      <w:proofErr w:type="spellStart"/>
+      <w:r>
+        <w:t>ms</w:t>
+      </w:r>
+      <w:proofErr w:type="spellEnd"/>
+    </w:p>
+    <w:p>
+      <w:r>
+        <w:rPr>
+          <w:rFonts w:ascii="Segoe UI Emoji" w:hAnsi="Segoe UI Emoji" w:cs="Segoe UI Emoji"/>
+        </w:rPr>
+        <w:t>🔥</w:t>
+      </w:r>
+      <w:r>
+        <w:t xml:space="preserve"> Average (Under Load): 28.11 </w:t>
+      </w:r>
+      <w:proofErr w:type="spellStart"/>
+      <w:r>
+        <w:t>ms</w:t>
+      </w:r>
+      <w:proofErr w:type="spellEnd"/>
+    </w:p>
+    <w:p>
+      <w:r>
+        <w:t>========================================</w:t>
+      </w:r>
+    </w:p>
+    <w:p>
+      <w:r>
+        <w:t xml:space="preserve">PS E:\College\PG\adaptive-database-connection-pooling\research-pool-lab&gt; node analyze_results.js results_adaptive_dynamic.csv                  </w:t>
+      </w:r>
+    </w:p>
+    <w:p/>
+    <w:p>
+      <w:r>
+        <w:rPr>
+          <w:rFonts w:ascii="Segoe UI Emoji" w:hAnsi="Segoe UI Emoji" w:cs="Segoe UI Emoji"/>
+        </w:rPr>
+        <w:t>📊</w:t>
+      </w:r>
+      <w:r>
+        <w:t xml:space="preserve"> ANALYSIS REPORT FOR: results_adaptive_dynamic.csv</w:t>
+      </w:r>
+    </w:p>
+    <w:p>
+      <w:r>
+        <w:t>========================================</w:t>
+      </w:r>
+    </w:p>
+    <w:p>
+      <w:r>
+        <w:rPr>
+          <w:rFonts w:ascii="Segoe UI Emoji" w:hAnsi="Segoe UI Emoji" w:cs="Segoe UI Emoji"/>
+        </w:rPr>
+        <w:t>🔹</w:t>
+      </w:r>
+      <w:r>
+        <w:t xml:space="preserve"> Total Data Points:  2050</w:t>
+      </w:r>
+    </w:p>
+    <w:p>
+      <w:r>
+        <w:rPr>
+          <w:rFonts w:ascii="Segoe UI Emoji" w:hAnsi="Segoe UI Emoji" w:cs="Segoe UI Emoji"/>
+        </w:rPr>
+        <w:t>🟢</w:t>
+      </w:r>
+      <w:r>
+        <w:t xml:space="preserve"> Minimum Lag:        19.91 </w:t>
+      </w:r>
+      <w:proofErr w:type="spellStart"/>
+      <w:r>
+        <w:t>ms</w:t>
+      </w:r>
+      <w:proofErr w:type="spellEnd"/>
+    </w:p>
+    <w:p>
+      <w:r>
+        <w:rPr>
+          <w:rFonts w:ascii="Segoe UI Emoji" w:hAnsi="Segoe UI Emoji" w:cs="Segoe UI Emoji"/>
+        </w:rPr>
+        <w:t>🔴</w:t>
+      </w:r>
+      <w:r>
+        <w:t xml:space="preserve"> Maximum Lag:        127.87 </w:t>
+      </w:r>
+      <w:proofErr w:type="spellStart"/>
+      <w:r>
+        <w:t>ms</w:t>
+      </w:r>
+      <w:proofErr w:type="spellEnd"/>
+    </w:p>
+    <w:p>
+      <w:r>
+        <w:t>----------------------------------------</w:t>
+      </w:r>
+    </w:p>
+    <w:p>
+      <w:r>
+        <w:rPr>
+          <w:rFonts w:ascii="Segoe UI Emoji" w:hAnsi="Segoe UI Emoji" w:cs="Segoe UI Emoji"/>
+        </w:rPr>
+        <w:t>📉</w:t>
+      </w:r>
+      <w:r>
+        <w:t xml:space="preserve"> Average (Overall):  22.97 </w:t>
+      </w:r>
+      <w:proofErr w:type="spellStart"/>
+      <w:r>
+        <w:t>ms</w:t>
+      </w:r>
+      <w:proofErr w:type="spellEnd"/>
+    </w:p>
+    <w:p>
+      <w:r>
+        <w:rPr>
+          <w:rFonts w:ascii="Segoe UI Emoji" w:hAnsi="Segoe UI Emoji" w:cs="Segoe UI Emoji"/>
+        </w:rPr>
+        <w:t>🔥</w:t>
+      </w:r>
+      <w:r>
+        <w:t xml:space="preserve"> Average (Under Load): 22.97 </w:t>
+      </w:r>
+      <w:proofErr w:type="spellStart"/>
+      <w:r>
+        <w:t>ms</w:t>
+      </w:r>
+      <w:proofErr w:type="spellEnd"/>
     </w:p>
     <w:p>
       <w:r>
@@ -1162,7 +1385,7 @@
   <w:style w:type="paragraph" w:default="1" w:styleId="Normal">
     <w:name w:val="Normal"/>
     <w:qFormat/>
-    <w:rsid w:val="001751BE"/>
+    <w:rsid w:val="00CA3770"/>
   </w:style>
   <w:style w:type="paragraph" w:styleId="Heading1">
     <w:name w:val="heading 1"/>

</xml_diff>